<commit_message>
fix: harden NyayBot security and upgrade dependencies
Co-authored-by: Copilot App <223556219+Copilot@users.noreply.github.com>
</commit_message>
<xml_diff>
--- a/NEW_PROJECT_DOCUMENTATION.docx
+++ b/NEW_PROJECT_DOCUMENTATION.docx
@@ -55,23 +55,8 @@
           <w:szCs w:val="24"/>
         </w:rPr>
       </w:pPr>
-      <w:proofErr w:type="spellStart"/>
-      <w:r>
-        <w:rPr>
-          <w:sz w:val="24"/>
-          <w:szCs w:val="24"/>
-          <w:highlight w:val="darkGray"/>
-        </w:rPr>
-        <w:t>NyayBot</w:t>
-      </w:r>
-      <w:proofErr w:type="spellEnd"/>
-      <w:r>
-        <w:rPr>
-          <w:sz w:val="24"/>
-          <w:szCs w:val="24"/>
-          <w:highlight w:val="darkGray"/>
-        </w:rPr>
-        <w:t xml:space="preserve"> is designed to solve a problem affecting over 800 million Indians who struggle to understand legal documents due to language and complexity barriers.</w:t>
+      <w:r>
+        <w:t>NyayBot aims to help people understand legal documents that are difficult to read because of complex language and language barriers.</w:t>
       </w:r>
     </w:p>
     <w:p>
@@ -500,12 +485,12 @@
     </w:p>
     <w:p>
       <w:r>
-        <w:t>· React JS and JavaScript for the frontend</w:t>
+        <w:t>· Next.js 16, React 19, TypeScript, and Tailwind CSS for the frontend</w:t>
       </w:r>
     </w:p>
     <w:p>
       <w:r>
-        <w:t>· pyPDF is used to extract text from the pdf uploaded</w:t>
+        <w:t>· PyMuPDF extracts selectable text from uploaded PDFs; scanned-image OCR is not implemented</w:t>
       </w:r>
     </w:p>
     <w:p>
@@ -516,7 +501,7 @@
     </w:p>
     <w:p>
       <w:r>
-        <w:t>· Grok API for AI-based summarization and translation</w:t>
+        <w:t>· Google Gemini API for AI-based risk analysis, summaries, Q&amp;A, and translation</w:t>
       </w:r>
     </w:p>
     <w:p>
@@ -527,17 +512,7 @@
         </w:rPr>
       </w:pPr>
       <w:r>
-        <w:t xml:space="preserve">· OCR integrated through </w:t>
-      </w:r>
-      <w:proofErr w:type="spellStart"/>
-      <w:r>
-        <w:t>FastAPI</w:t>
-      </w:r>
-      <w:proofErr w:type="spellEnd"/>
-      <w:r>
-        <w:t xml:space="preserve"> for text extraction</w:t>
-      </w:r>
-      <w:r>
+        <w:t>· FastAPI provides the backend API; Bhashini is an optional translation and text-to-speech provider</w:t>
         <w:br/>
       </w:r>
     </w:p>
@@ -643,165 +618,7 @@
         </w:rPr>
       </w:pPr>
       <w:r>
-        <w:rPr>
-          <w:rFonts w:hint="eastAsia"/>
-          <w:sz w:val="28"/>
-          <w:szCs w:val="28"/>
-          <w:lang w:val="en-IN"/>
-        </w:rPr>
-        <w:t xml:space="preserve">User </w:t>
-      </w:r>
-      <w:r>
-        <w:rPr>
-          <w:rFonts w:hint="eastAsia"/>
-          <w:sz w:val="28"/>
-          <w:szCs w:val="28"/>
-          <w:lang w:val="en-IN"/>
-        </w:rPr>
-        <w:t>→</w:t>
-      </w:r>
-      <w:r>
-        <w:rPr>
-          <w:rFonts w:hint="eastAsia"/>
-          <w:sz w:val="28"/>
-          <w:szCs w:val="28"/>
-          <w:lang w:val="en-IN"/>
-        </w:rPr>
-        <w:t xml:space="preserve"> Upload </w:t>
-      </w:r>
-      <w:r>
-        <w:rPr>
-          <w:rFonts w:hint="eastAsia"/>
-          <w:sz w:val="28"/>
-          <w:szCs w:val="28"/>
-          <w:lang w:val="en-IN"/>
-        </w:rPr>
-        <w:t>→</w:t>
-      </w:r>
-      <w:r>
-        <w:rPr>
-          <w:rFonts w:hint="eastAsia"/>
-          <w:sz w:val="28"/>
-          <w:szCs w:val="28"/>
-          <w:lang w:val="en-IN"/>
-        </w:rPr>
-        <w:t xml:space="preserve"> OCR </w:t>
-      </w:r>
-      <w:r>
-        <w:rPr>
-          <w:rFonts w:hint="eastAsia"/>
-          <w:sz w:val="28"/>
-          <w:szCs w:val="28"/>
-          <w:lang w:val="en-IN"/>
-        </w:rPr>
-        <w:t>→</w:t>
-      </w:r>
-      <w:r>
-        <w:rPr>
-          <w:rFonts w:hint="eastAsia"/>
-          <w:sz w:val="28"/>
-          <w:szCs w:val="28"/>
-          <w:lang w:val="en-IN"/>
-        </w:rPr>
-        <w:t xml:space="preserve"> Text Extraction </w:t>
-      </w:r>
-      <w:r>
-        <w:rPr>
-          <w:rFonts w:hint="eastAsia"/>
-          <w:sz w:val="28"/>
-          <w:szCs w:val="28"/>
-          <w:lang w:val="en-IN"/>
-        </w:rPr>
-        <w:t>→</w:t>
-      </w:r>
-      <w:r>
-        <w:rPr>
-          <w:rFonts w:hint="eastAsia"/>
-          <w:sz w:val="28"/>
-          <w:szCs w:val="28"/>
-          <w:lang w:val="en-IN"/>
-        </w:rPr>
-        <w:t xml:space="preserve"> Chunking </w:t>
-      </w:r>
-      <w:r>
-        <w:rPr>
-          <w:rFonts w:hint="eastAsia"/>
-          <w:sz w:val="28"/>
-          <w:szCs w:val="28"/>
-          <w:lang w:val="en-IN"/>
-        </w:rPr>
-        <w:t>→</w:t>
-      </w:r>
-      <w:r>
-        <w:rPr>
-          <w:rFonts w:hint="eastAsia"/>
-          <w:sz w:val="28"/>
-          <w:szCs w:val="28"/>
-          <w:lang w:val="en-IN"/>
-        </w:rPr>
-        <w:t xml:space="preserve"> Processing </w:t>
-      </w:r>
-      <w:r>
-        <w:rPr>
-          <w:rFonts w:hint="eastAsia"/>
-          <w:sz w:val="28"/>
-          <w:szCs w:val="28"/>
-          <w:lang w:val="en-IN"/>
-        </w:rPr>
-        <w:t>→</w:t>
-      </w:r>
-      <w:r>
-        <w:rPr>
-          <w:rFonts w:hint="eastAsia"/>
-          <w:sz w:val="28"/>
-          <w:szCs w:val="28"/>
-          <w:lang w:val="en-IN"/>
-        </w:rPr>
-        <w:t xml:space="preserve"> Summarization </w:t>
-      </w:r>
-      <w:r>
-        <w:rPr>
-          <w:rFonts w:hint="eastAsia"/>
-          <w:sz w:val="28"/>
-          <w:szCs w:val="28"/>
-          <w:lang w:val="en-IN"/>
-        </w:rPr>
-        <w:t>→</w:t>
-      </w:r>
-      <w:r>
-        <w:rPr>
-          <w:rFonts w:hint="eastAsia"/>
-          <w:sz w:val="28"/>
-          <w:szCs w:val="28"/>
-          <w:lang w:val="en-IN"/>
-        </w:rPr>
-        <w:t xml:space="preserve"> Translation </w:t>
-      </w:r>
-      <w:r>
-        <w:rPr>
-          <w:rFonts w:hint="eastAsia"/>
-          <w:sz w:val="28"/>
-          <w:szCs w:val="28"/>
-          <w:lang w:val="en-IN"/>
-        </w:rPr>
-        <w:t>→</w:t>
-      </w:r>
-      <w:r>
-        <w:rPr>
-          <w:rFonts w:hint="eastAsia"/>
-          <w:sz w:val="28"/>
-          <w:szCs w:val="28"/>
-          <w:lang w:val="en-IN"/>
-        </w:rPr>
-        <w:t xml:space="preserve"> Output</w:t>
-      </w:r>
-      <w:r>
-        <w:rPr>
-          <w:sz w:val="28"/>
-          <w:szCs w:val="28"/>
-          <w:lang w:val="en-IN"/>
-        </w:rPr>
-        <w:br/>
+        <w:t>User uploads a PDF ? text extraction ? chunking ? risk analysis and summary ? results and document Q&amp;A</w:t>
       </w:r>
     </w:p>
     <w:p>
@@ -884,40 +701,7 @@
         </w:rPr>
       </w:pPr>
       <w:r>
-        <w:rPr>
-          <w:sz w:val="24"/>
-          <w:szCs w:val="24"/>
-        </w:rPr>
-        <w:t>-</w:t>
-      </w:r>
-      <w:r>
-        <w:rPr>
-          <w:sz w:val="24"/>
-          <w:szCs w:val="24"/>
-        </w:rPr>
-        <w:t>To improve accuracy, the system processes only relevant parts of the document while generating responses. This helps reduce incorrect or misleading outputs and ensures better understanding.</w:t>
-      </w:r>
-      <w:r>
-        <w:rPr>
-          <w:sz w:val="24"/>
-          <w:szCs w:val="24"/>
-        </w:rPr>
-        <w:br/>
-      </w:r>
-      <w:r>
-        <w:rPr>
-          <w:sz w:val="24"/>
-          <w:szCs w:val="24"/>
-        </w:rPr>
-        <w:lastRenderedPageBreak/>
-        <w:t>-</w:t>
-      </w:r>
-      <w:r>
-        <w:rPr>
-          <w:sz w:val="24"/>
-          <w:szCs w:val="24"/>
-        </w:rPr>
-        <w:t>The system uses a retrieval-based approach to process only relevant parts of the document, improving accuracy and reducing incorrect outputs.</w:t>
+        <w:t>-For Q&amp;A, the backend ranks cached chunks using token overlap and sends selected excerpts to Gemini. This is keyword retrieval, not a vector index, and does not guarantee accuracy.</w:t>
       </w:r>
     </w:p>
     <w:p>
@@ -1017,7 +801,7 @@
     </w:p>
     <w:p>
       <w:r>
-        <w:t>· OCR didn’t always extract correct text</w:t>
+        <w:t>Scanned-image PDFs are unsupported because OCR is not implemented</w:t>
       </w:r>
     </w:p>
     <w:p>
@@ -1043,7 +827,7 @@
     </w:p>
     <w:p>
       <w:r>
-        <w:t>· Reduced API calls</w:t>
+        <w:t>Bounded document and prompt sizes</w:t>
       </w:r>
     </w:p>
     <w:p/>
@@ -1258,7 +1042,7 @@
     </w:p>
     <w:p>
       <w:r>
-        <w:t>Documents are processed temporarily and not stored</w:t>
+        <w:t>The app does not save documents to an application database. Frontend state and the bounded chunk cache are transient; upload parsing may use temporary server files, and text is sent to configured Gemini/Bhashini services.</w:t>
       </w:r>
     </w:p>
     <w:p>
@@ -1374,7 +1158,7 @@
         </w:numPr>
       </w:pPr>
       <w:r>
-        <w:t>Documents are processed temporarily and not stored</w:t>
+        <w:t>The API currently has no user authentication or per-user document authorization. CORS only restricts browser origins and is not an access-control boundary.</w:t>
       </w:r>
     </w:p>
     <w:p/>
@@ -2117,7 +1901,7 @@
     </w:p>
     <w:p>
       <w:r>
-        <w:t>· OCR accuracy</w:t>
+        <w:t>· Scanned-image OCR is not implemented; only PDFs with extractable text are supported</w:t>
       </w:r>
     </w:p>
     <w:p>
@@ -2411,12 +2195,12 @@
     </w:p>
     <w:p>
       <w:r>
-        <w:t>· Simple understanding within 1 minute</w:t>
+        <w:t>Provide plain-language explanations in the selected language</w:t>
       </w:r>
     </w:p>
     <w:p>
       <w:r>
-        <w:t>· Supports multiple Indian languages</w:t>
+        <w:t>· The application supports 11 configured Indian languages</w:t>
       </w:r>
     </w:p>
     <w:p>

</xml_diff>